<commit_message>
Drop the speculative remote+custom section from the CLI reference
Not a distinct workflow to document separately - it's just Section
2's authoring steps combined with Section 3's execution steps, per
feedback. Overview matrix note updated to say so directly instead of
carrying a speculative "not attempted" section.

Co-Authored-By: Claude Sonnet 5 <noreply@anthropic.com>
</commit_message>
<xml_diff>
--- a/AWS-Transform-CLI-Command-Reference.docx
+++ b/AWS-Transform-CLI-Command-Reference.docx
@@ -212,7 +212,7 @@
               <w:rPr>
                 <w:sz w:val="20"/>
               </w:rPr>
-              <w:t>Not attempted — inferred only, see Section 5</w:t>
+              <w:t>Not run as its own case — same authoring steps as Section 2, dropped into the same --transformation-name slot as Section 3.4</w:t>
             </w:r>
           </w:p>
         </w:tc>
@@ -1607,122 +1607,6 @@
         <w:t>Preserves account-scoped S3/KMS resources by design (reused on re-provision); only deletes the EC2 instance and its own stack.</w:t>
       </w:r>
     </w:p>
-    <w:p>
-      <w:pPr>
-        <w:pStyle w:val="Heading1"/>
-      </w:pPr>
-      <w:r>
-        <w:t>4. Remote Repo + Custom Definition — Not Attempted</w:t>
-      </w:r>
-    </w:p>
-    <w:p>
-      <w:r>
-        <w:rPr>
-          <w:b w:val="0"/>
-          <w:i w:val="0"/>
-        </w:rPr>
-        <w:t>This combination was never actually run. What follows is inferred from the documented behavior of --transformation-name in both command families, not a verified result — flagged explicitly rather than presented as tested.</w:t>
-      </w:r>
-    </w:p>
-    <w:p>
-      <w:r>
-        <w:rPr>
-          <w:b w:val="0"/>
-          <w:i w:val="0"/>
-        </w:rPr>
-        <w:t>atx ct remote remediation’s --transformation-name flag is not restricted to the AWS/ namespace — the same flag accepted our own emumba-java-pojo-to-record definition in the local exec command (Section 2.3). The likely combination, if attempted:</w:t>
-      </w:r>
-    </w:p>
-    <w:p>
-      <w:pPr>
-        <w:spacing w:before="80" w:after="160"/>
-        <w:ind w:left="360"/>
-        <w:shd w:val="clear" w:color="auto" w:fill="F2F2F2"/>
-      </w:pPr>
-      <w:r>
-        <w:rPr>
-          <w:rFonts w:ascii="Consolas" w:hAnsi="Consolas"/>
-          <w:color w:val="1A1A1A"/>
-          <w:sz w:val="18"/>
-        </w:rPr>
-        <w:t># Steps 1-3 identical to Section 3 (register source, discover, provision EC2)</w:t>
-      </w:r>
-      <w:r>
-        <w:br/>
-      </w:r>
-      <w:r>
-        <w:rPr>
-          <w:rFonts w:ascii="Consolas" w:hAnsi="Consolas"/>
-          <w:color w:val="1A1A1A"/>
-          <w:sz w:val="18"/>
-        </w:rPr>
-        <w:t xml:space="preserve"> </w:t>
-      </w:r>
-      <w:r>
-        <w:br/>
-      </w:r>
-      <w:r>
-        <w:rPr>
-          <w:rFonts w:ascii="Consolas" w:hAnsi="Consolas"/>
-          <w:color w:val="1A1A1A"/>
-          <w:sz w:val="18"/>
-        </w:rPr>
-        <w:t># Publish the custom definition first (as in Section 2.2), then:</w:t>
-      </w:r>
-      <w:r>
-        <w:br/>
-      </w:r>
-      <w:r>
-        <w:rPr>
-          <w:rFonts w:ascii="Consolas" w:hAnsi="Consolas"/>
-          <w:color w:val="1A1A1A"/>
-          <w:sz w:val="18"/>
-        </w:rPr>
-        <w:t>atx ct remote remediation \</w:t>
-      </w:r>
-      <w:r>
-        <w:br/>
-      </w:r>
-      <w:r>
-        <w:rPr>
-          <w:rFonts w:ascii="Consolas" w:hAnsi="Consolas"/>
-          <w:color w:val="1A1A1A"/>
-          <w:sz w:val="18"/>
-        </w:rPr>
-        <w:t xml:space="preserve">  --repos "gh-demo::repo-a" \</w:t>
-      </w:r>
-      <w:r>
-        <w:br/>
-      </w:r>
-      <w:r>
-        <w:rPr>
-          <w:rFonts w:ascii="Consolas" w:hAnsi="Consolas"/>
-          <w:color w:val="1A1A1A"/>
-          <w:sz w:val="18"/>
-        </w:rPr>
-        <w:t xml:space="preserve">  --transformation-name emumba-java-pojo-to-record \</w:t>
-      </w:r>
-      <w:r>
-        <w:br/>
-      </w:r>
-      <w:r>
-        <w:rPr>
-          <w:rFonts w:ascii="Consolas" w:hAnsi="Consolas"/>
-          <w:color w:val="1A1A1A"/>
-          <w:sz w:val="18"/>
-        </w:rPr>
-        <w:t xml:space="preserve">  --mode ec2 --stack-name atx-runner</w:t>
-      </w:r>
-    </w:p>
-    <w:p>
-      <w:r>
-        <w:rPr>
-          <w:b w:val="0"/>
-          <w:i/>
-        </w:rPr>
-        <w:t>What is NOT known without actually running this: whether a draft-only definition (not published) behaves the same way remotely as it does locally (Section 2.2 found publish was required even for local exec), and whether the remote worker container has the same access to a locally-registered custom definition as the local CLI does. This is the one gap left in this exercise’s coverage.</w:t>
-      </w:r>
-    </w:p>
     <w:sectPr>
       <w:pgSz w:w="12240" w:h="15840"/>
       <w:pgMar w:top="1440" w:right="1800" w:bottom="1440" w:left="1800" w:header="720" w:footer="720" w:gutter="0"/>

</xml_diff>

<commit_message>
Add language/technology coverage appendix to the CLI reference
Pulled fresh from the live registry (34 AWS-managed transformations,
not from memory) and grouped by language. Highlights where AWS-
managed coverage is strong (Java, Python, Node.js/TS) vs. narrow
(.NET, Ruby, VBA) vs. absent (Go, Rust, PHP, C/C++, Kotlin, Swift,
COBOL) - the latter being candidates for custom transformations,
explicitly flagged as unverified beyond the one Java case actually
tested.

Co-Authored-By: Claude Sonnet 5 <noreply@anthropic.com>
</commit_message>
<xml_diff>
--- a/AWS-Transform-CLI-Command-Reference.docx
+++ b/AWS-Transform-CLI-Command-Reference.docx
@@ -1607,6 +1607,506 @@
         <w:t>Preserves account-scoped S3/KMS resources by design (reused on re-provision); only deletes the EC2 instance and its own stack.</w:t>
       </w:r>
     </w:p>
+    <w:p>
+      <w:pPr>
+        <w:pStyle w:val="Heading1"/>
+      </w:pPr>
+      <w:r>
+        <w:t>Appendix A: Language and Technology Coverage</w:t>
+      </w:r>
+    </w:p>
+    <w:p>
+      <w:r>
+        <w:rPr>
+          <w:b w:val="0"/>
+          <w:i w:val="0"/>
+        </w:rPr>
+        <w:t>Pulled fresh from the live registry (atx custom def list --json) rather than from memory — 34 AWS-managed transformations as of this session, grouped by the language or technology they target. Where no AWS-managed transformation exists, authoring a custom one (Section 2) is the option — not a guaranteed capability for every such language, since only one custom case (Java) has actually been verified in this exercise, but the mechanism itself is language-agnostic: a SKILL.md is a natural-language instruction for the underlying coding agent, not a language-specific plugin.</w:t>
+      </w:r>
+    </w:p>
+    <w:tbl>
+      <w:tblPr>
+        <w:tblStyle w:val="LightGrid-Accent1"/>
+        <w:tblW w:type="auto" w:w="0"/>
+        <w:jc w:val="center"/>
+        <w:tblLook w:firstColumn="1" w:firstRow="1" w:lastColumn="0" w:lastRow="0" w:noHBand="0" w:noVBand="1" w:val="04A0"/>
+      </w:tblPr>
+      <w:tblGrid>
+        <w:gridCol w:w="2880"/>
+        <w:gridCol w:w="2880"/>
+        <w:gridCol w:w="2880"/>
+      </w:tblGrid>
+      <w:tr>
+        <w:tc>
+          <w:tcPr>
+            <w:tcW w:type="dxa" w:w="2592"/>
+            <w:shd w:val="clear" w:color="auto" w:fill="2E5395"/>
+          </w:tcPr>
+          <w:p>
+            <w:r>
+              <w:rPr>
+                <w:b/>
+                <w:color w:val="FFFFFF"/>
+                <w:sz w:val="20"/>
+              </w:rPr>
+              <w:t>Language / Technology</w:t>
+            </w:r>
+          </w:p>
+        </w:tc>
+        <w:tc>
+          <w:tcPr>
+            <w:tcW w:type="dxa" w:w="1872"/>
+            <w:shd w:val="clear" w:color="auto" w:fill="2E5395"/>
+          </w:tcPr>
+          <w:p>
+            <w:r>
+              <w:rPr>
+                <w:b/>
+                <w:color w:val="FFFFFF"/>
+                <w:sz w:val="20"/>
+              </w:rPr>
+              <w:t>AWS-Managed Coverage</w:t>
+            </w:r>
+          </w:p>
+        </w:tc>
+        <w:tc>
+          <w:tcPr>
+            <w:tcW w:type="dxa" w:w="5328"/>
+            <w:shd w:val="clear" w:color="auto" w:fill="2E5395"/>
+          </w:tcPr>
+          <w:p>
+            <w:r>
+              <w:rPr>
+                <w:b/>
+                <w:color w:val="FFFFFF"/>
+                <w:sz w:val="20"/>
+              </w:rPr>
+              <w:t>Relevant Transformations</w:t>
+            </w:r>
+          </w:p>
+        </w:tc>
+      </w:tr>
+      <w:tr>
+        <w:tc>
+          <w:tcPr>
+            <w:tcW w:type="dxa" w:w="2592"/>
+          </w:tcPr>
+          <w:p>
+            <w:r>
+              <w:rPr>
+                <w:sz w:val="20"/>
+              </w:rPr>
+              <w:t>Java</w:t>
+            </w:r>
+          </w:p>
+        </w:tc>
+        <w:tc>
+          <w:tcPr>
+            <w:tcW w:type="dxa" w:w="1872"/>
+          </w:tcPr>
+          <w:p>
+            <w:r>
+              <w:rPr>
+                <w:sz w:val="20"/>
+              </w:rPr>
+              <w:t>Extensive (11 of 34 TDs)</w:t>
+            </w:r>
+          </w:p>
+        </w:tc>
+        <w:tc>
+          <w:tcPr>
+            <w:tcW w:type="dxa" w:w="5328"/>
+          </w:tcPr>
+          <w:p>
+            <w:r>
+              <w:rPr>
+                <w:sz w:val="20"/>
+              </w:rPr>
+              <w:t>java-version-upgrade, java-aws-sdk-v1-to-v2, java-performance-optimization, early-access-java-x86-to-graviton, early-access-log4j-to-slf4j-migration, oracle-java-to-corretto, spring-boot-version-upgrade, JBoss-to-Spring-Boot, mulesoft-to-aws-native-java, payshield-hsm-to-aws-payment-cryptography, websphere-jaxrs-to-bedrock-agentcore</w:t>
+            </w:r>
+          </w:p>
+        </w:tc>
+      </w:tr>
+      <w:tr>
+        <w:tc>
+          <w:tcPr>
+            <w:tcW w:type="dxa" w:w="2592"/>
+          </w:tcPr>
+          <w:p>
+            <w:r>
+              <w:rPr>
+                <w:sz w:val="20"/>
+              </w:rPr>
+              <w:t>Python</w:t>
+            </w:r>
+          </w:p>
+        </w:tc>
+        <w:tc>
+          <w:tcPr>
+            <w:tcW w:type="dxa" w:w="1872"/>
+          </w:tcPr>
+          <w:p>
+            <w:r>
+              <w:rPr>
+                <w:sz w:val="20"/>
+              </w:rPr>
+              <w:t>Good</w:t>
+            </w:r>
+          </w:p>
+        </w:tc>
+        <w:tc>
+          <w:tcPr>
+            <w:tcW w:type="dxa" w:w="5328"/>
+          </w:tcPr>
+          <w:p>
+            <w:r>
+              <w:rPr>
+                <w:sz w:val="20"/>
+              </w:rPr>
+              <w:t>python-version-upgrade, python-boto2-to-boto3, mulesoft-to-aws-native-python, vba-to-python-migration (as target)</w:t>
+            </w:r>
+          </w:p>
+        </w:tc>
+      </w:tr>
+      <w:tr>
+        <w:tc>
+          <w:tcPr>
+            <w:tcW w:type="dxa" w:w="2592"/>
+          </w:tcPr>
+          <w:p>
+            <w:r>
+              <w:rPr>
+                <w:sz w:val="20"/>
+              </w:rPr>
+              <w:t>Node.js / TypeScript / JavaScript</w:t>
+            </w:r>
+          </w:p>
+        </w:tc>
+        <w:tc>
+          <w:tcPr>
+            <w:tcW w:type="dxa" w:w="1872"/>
+          </w:tcPr>
+          <w:p>
+            <w:r>
+              <w:rPr>
+                <w:sz w:val="20"/>
+              </w:rPr>
+              <w:t>Good</w:t>
+            </w:r>
+          </w:p>
+        </w:tc>
+        <w:tc>
+          <w:tcPr>
+            <w:tcW w:type="dxa" w:w="5328"/>
+          </w:tcPr>
+          <w:p>
+            <w:r>
+              <w:rPr>
+                <w:sz w:val="20"/>
+              </w:rPr>
+              <w:t>nodejs-version-upgrade, nodejs-aws-sdk-v2-to-v3, lambda-nodejs-runtime-upgrade, angular-version-upgrade, vue.js-version-upgrade, early-access-angular-to-react-migration</w:t>
+            </w:r>
+          </w:p>
+        </w:tc>
+      </w:tr>
+      <w:tr>
+        <w:tc>
+          <w:tcPr>
+            <w:tcW w:type="dxa" w:w="2592"/>
+          </w:tcPr>
+          <w:p>
+            <w:r>
+              <w:rPr>
+                <w:sz w:val="20"/>
+              </w:rPr>
+              <w:t>.NET / C#</w:t>
+            </w:r>
+          </w:p>
+        </w:tc>
+        <w:tc>
+          <w:tcPr>
+            <w:tcW w:type="dxa" w:w="1872"/>
+          </w:tcPr>
+          <w:p>
+            <w:r>
+              <w:rPr>
+                <w:sz w:val="20"/>
+              </w:rPr>
+              <w:t>Narrow</w:t>
+            </w:r>
+          </w:p>
+        </w:tc>
+        <w:tc>
+          <w:tcPr>
+            <w:tcW w:type="dxa" w:w="5328"/>
+          </w:tcPr>
+          <w:p>
+            <w:r>
+              <w:rPr>
+                <w:sz w:val="20"/>
+              </w:rPr>
+              <w:t>dotnet-lambda-upgrade (Lambda runtime only — no general .NET Framework → .NET Core modernization TD)</w:t>
+            </w:r>
+          </w:p>
+        </w:tc>
+      </w:tr>
+      <w:tr>
+        <w:tc>
+          <w:tcPr>
+            <w:tcW w:type="dxa" w:w="2592"/>
+          </w:tcPr>
+          <w:p>
+            <w:r>
+              <w:rPr>
+                <w:sz w:val="20"/>
+              </w:rPr>
+              <w:t>Ruby</w:t>
+            </w:r>
+          </w:p>
+        </w:tc>
+        <w:tc>
+          <w:tcPr>
+            <w:tcW w:type="dxa" w:w="1872"/>
+          </w:tcPr>
+          <w:p>
+            <w:r>
+              <w:rPr>
+                <w:sz w:val="20"/>
+              </w:rPr>
+              <w:t>Covered</w:t>
+            </w:r>
+          </w:p>
+        </w:tc>
+        <w:tc>
+          <w:tcPr>
+            <w:tcW w:type="dxa" w:w="5328"/>
+          </w:tcPr>
+          <w:p>
+            <w:r>
+              <w:rPr>
+                <w:sz w:val="20"/>
+              </w:rPr>
+              <w:t>ruby-upgrade (2.x → 4.0, plus Rails/Sinatra framework upgrade)</w:t>
+            </w:r>
+          </w:p>
+        </w:tc>
+      </w:tr>
+      <w:tr>
+        <w:tc>
+          <w:tcPr>
+            <w:tcW w:type="dxa" w:w="2592"/>
+          </w:tcPr>
+          <w:p>
+            <w:r>
+              <w:rPr>
+                <w:sz w:val="20"/>
+              </w:rPr>
+              <w:t>VBA (Excel)</w:t>
+            </w:r>
+          </w:p>
+        </w:tc>
+        <w:tc>
+          <w:tcPr>
+            <w:tcW w:type="dxa" w:w="1872"/>
+          </w:tcPr>
+          <w:p>
+            <w:r>
+              <w:rPr>
+                <w:sz w:val="20"/>
+              </w:rPr>
+              <w:t>Covered as a migration source</w:t>
+            </w:r>
+          </w:p>
+        </w:tc>
+        <w:tc>
+          <w:tcPr>
+            <w:tcW w:type="dxa" w:w="5328"/>
+          </w:tcPr>
+          <w:p>
+            <w:r>
+              <w:rPr>
+                <w:sz w:val="20"/>
+              </w:rPr>
+              <w:t>vba-to-python-migration (migrates out of VBA into Python — not an in-place VBA modernization)</w:t>
+            </w:r>
+          </w:p>
+        </w:tc>
+      </w:tr>
+      <w:tr>
+        <w:tc>
+          <w:tcPr>
+            <w:tcW w:type="dxa" w:w="2592"/>
+          </w:tcPr>
+          <w:p>
+            <w:r>
+              <w:rPr>
+                <w:sz w:val="20"/>
+              </w:rPr>
+              <w:t>Oracle Service Bus / BPEL</w:t>
+            </w:r>
+          </w:p>
+        </w:tc>
+        <w:tc>
+          <w:tcPr>
+            <w:tcW w:type="dxa" w:w="1872"/>
+          </w:tcPr>
+          <w:p>
+            <w:r>
+              <w:rPr>
+                <w:sz w:val="20"/>
+              </w:rPr>
+              <w:t>Covered (niche)</w:t>
+            </w:r>
+          </w:p>
+        </w:tc>
+        <w:tc>
+          <w:tcPr>
+            <w:tcW w:type="dxa" w:w="5328"/>
+          </w:tcPr>
+          <w:p>
+            <w:r>
+              <w:rPr>
+                <w:sz w:val="20"/>
+              </w:rPr>
+              <w:t>oracle-service-bus-to-aws (generates a CDK TypeScript replacement, not an in-place upgrade)</w:t>
+            </w:r>
+          </w:p>
+        </w:tc>
+      </w:tr>
+      <w:tr>
+        <w:tc>
+          <w:tcPr>
+            <w:tcW w:type="dxa" w:w="2592"/>
+          </w:tcPr>
+          <w:p>
+            <w:r>
+              <w:rPr>
+                <w:sz w:val="20"/>
+              </w:rPr>
+              <w:t>MuleSoft</w:t>
+            </w:r>
+          </w:p>
+        </w:tc>
+        <w:tc>
+          <w:tcPr>
+            <w:tcW w:type="dxa" w:w="1872"/>
+          </w:tcPr>
+          <w:p>
+            <w:r>
+              <w:rPr>
+                <w:sz w:val="20"/>
+              </w:rPr>
+              <w:t>Covered (niche)</w:t>
+            </w:r>
+          </w:p>
+        </w:tc>
+        <w:tc>
+          <w:tcPr>
+            <w:tcW w:type="dxa" w:w="5328"/>
+          </w:tcPr>
+          <w:p>
+            <w:r>
+              <w:rPr>
+                <w:sz w:val="20"/>
+              </w:rPr>
+              <w:t>mulesoft-to-aws-native-java, mulesoft-to-aws-native-python (targets Java or Python Lambda)</w:t>
+            </w:r>
+          </w:p>
+        </w:tc>
+      </w:tr>
+      <w:tr>
+        <w:tc>
+          <w:tcPr>
+            <w:tcW w:type="dxa" w:w="2592"/>
+          </w:tcPr>
+          <w:p>
+            <w:r>
+              <w:rPr>
+                <w:sz w:val="20"/>
+              </w:rPr>
+              <w:t>Go, Rust, PHP, C/C++, Kotlin, Swift, Perl, general .NET Framework apps</w:t>
+            </w:r>
+          </w:p>
+        </w:tc>
+        <w:tc>
+          <w:tcPr>
+            <w:tcW w:type="dxa" w:w="1872"/>
+          </w:tcPr>
+          <w:p>
+            <w:r>
+              <w:rPr>
+                <w:sz w:val="20"/>
+              </w:rPr>
+              <w:t>None found</w:t>
+            </w:r>
+          </w:p>
+        </w:tc>
+        <w:tc>
+          <w:tcPr>
+            <w:tcW w:type="dxa" w:w="5328"/>
+          </w:tcPr>
+          <w:p>
+            <w:r>
+              <w:rPr>
+                <w:sz w:val="20"/>
+              </w:rPr>
+              <w:t>No AWS-managed TD exists for these as of this session — a candidate set for authoring a custom SKILL.md (Section 2), unverified beyond the mechanism itself</w:t>
+            </w:r>
+          </w:p>
+        </w:tc>
+      </w:tr>
+      <w:tr>
+        <w:tc>
+          <w:tcPr>
+            <w:tcW w:type="dxa" w:w="2592"/>
+          </w:tcPr>
+          <w:p>
+            <w:r>
+              <w:rPr>
+                <w:sz w:val="20"/>
+              </w:rPr>
+              <w:t>COBOL / mainframe languages</w:t>
+            </w:r>
+          </w:p>
+        </w:tc>
+        <w:tc>
+          <w:tcPr>
+            <w:tcW w:type="dxa" w:w="1872"/>
+          </w:tcPr>
+          <w:p>
+            <w:r>
+              <w:rPr>
+                <w:sz w:val="20"/>
+              </w:rPr>
+              <w:t>Not in this registry</w:t>
+            </w:r>
+          </w:p>
+        </w:tc>
+        <w:tc>
+          <w:tcPr>
+            <w:tcW w:type="dxa" w:w="5328"/>
+          </w:tcPr>
+          <w:p>
+            <w:r>
+              <w:rPr>
+                <w:sz w:val="20"/>
+              </w:rPr>
+              <w:t>AWS addresses this via a separate product track, "AWS Transform for Mainframe" — outside atx custom’s registry entirely</w:t>
+            </w:r>
+          </w:p>
+        </w:tc>
+      </w:tr>
+    </w:tbl>
+    <w:p/>
+    <w:p>
+      <w:r>
+        <w:rPr>
+          <w:b w:val="0"/>
+          <w:i/>
+        </w:rPr>
+        <w:t>Also present in the registry but not language-specific — portfolio/analysis/advisory transformations rather than code migrations: comprehensive-codebase-analysis, agentic-readiness-analysis, modernization-readiness-analysis, portfolio-modernization-readiness-analysis, portfolio-agentic-readiness-analysis, GenAI-to-Bedrock-Migration-Assessment, business-rules-extraction, security-issue-fixer, agent-runtime-advisor, and datadog-monitors-to-cloudwatch-alarms.</w:t>
+      </w:r>
+    </w:p>
     <w:sectPr>
       <w:pgSz w:w="12240" w:h="15840"/>
       <w:pgMar w:top="1440" w:right="1800" w:bottom="1440" w:left="1800" w:header="720" w:footer="720" w:gutter="0"/>

</xml_diff>